<commit_message>
Finalize proposal and prepare draft Module Analysis
</commit_message>
<xml_diff>
--- a/docs/PSM Proposal_YAPZHANHONG_B032310386.docx
+++ b/docs/PSM Proposal_YAPZHANHONG_B032310386.docx
@@ -866,19 +866,13 @@
               <w:t xml:space="preserve"> </w:t>
             </w:r>
             <w:r>
-              <w:t>(</w:t>
+              <w:t xml:space="preserve">: </w:t>
             </w:r>
             <w:r>
               <w:t>WEBCAM-BASED GAZE-CONTROLLED SYSTEM FOR</w:t>
             </w:r>
             <w:r>
               <w:t xml:space="preserve"> ASSISTIVE TECHNOLOGY</w:t>
-            </w:r>
-            <w:r>
-              <w:rPr>
-                <w:spacing w:val="-2"/>
-              </w:rPr>
-              <w:t>)</w:t>
             </w:r>
           </w:p>
         </w:tc>
@@ -1544,7 +1538,7 @@
                 </mc:Choice>
                 <mc:Fallback>
                   <w:pict>
-                    <v:group w14:anchorId="37A85445" id="Group 4" o:spid="_x0000_s1026" style="width:14.2pt;height:14.05pt;mso-position-horizontal-relative:char;mso-position-vertical-relative:line" coordsize="180340,178435" o:gfxdata="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">
+                    <v:group w14:anchorId="285AFC4D" id="Group 4" o:spid="_x0000_s1026" style="width:14.2pt;height:14.05pt;mso-position-horizontal-relative:char;mso-position-vertical-relative:line" coordsize="180340,178435" o:gfxdata="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">
                       <v:shape id="Graphic 5" o:spid="_x0000_s1027" style="position:absolute;left:7620;top:9144;width:163830;height:160020;visibility:visible;mso-wrap-style:square;v-text-anchor:top" coordsize="163830,160020" o:gfxdata="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" path="m163372,l,,,160020r163372,l163372,xe" fillcolor="#edebe0" stroked="f">
                         <v:path arrowok="t"/>
                       </v:shape>
@@ -1777,7 +1771,7 @@
                 </mc:Choice>
                 <mc:Fallback>
                   <w:pict>
-                    <v:group w14:anchorId="5896E1A8" id="Group 7" o:spid="_x0000_s1026" style="position:absolute;margin-left:32.4pt;margin-top:3.35pt;width:14.3pt;height:14.05pt;z-index:-16009216;mso-wrap-distance-left:0;mso-wrap-distance-right:0" coordsize="181610,178435" o:gfxdata="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">
+                    <v:group w14:anchorId="38876079" id="Group 7" o:spid="_x0000_s1026" style="position:absolute;margin-left:32.4pt;margin-top:3.35pt;width:14.3pt;height:14.05pt;z-index:-16009216;mso-wrap-distance-left:0;mso-wrap-distance-right:0" coordsize="181610,178435" o:gfxdata="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">
                       <v:shape id="Graphic 8" o:spid="_x0000_s1027" style="position:absolute;left:9144;top:9144;width:163195;height:160020;visibility:visible;mso-wrap-style:square;v-text-anchor:top" coordsize="163195,160020" o:gfxdata="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" path="m163067,l,,,160020r163067,l163067,xe" fillcolor="#edebe0" stroked="f">
                         <v:path arrowok="t"/>
                       </v:shape>
@@ -2016,7 +2010,7 @@
                 </mc:Choice>
                 <mc:Fallback>
                   <w:pict>
-                    <v:group w14:anchorId="2F926EED" id="Group 10" o:spid="_x0000_s1026" style="position:absolute;margin-left:30.55pt;margin-top:3.35pt;width:14.2pt;height:14.05pt;z-index:-16008704;mso-wrap-distance-left:0;mso-wrap-distance-right:0" coordsize="180340,178435" o:gfxdata="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">
+                    <v:group w14:anchorId="0B3BD180" id="Group 10" o:spid="_x0000_s1026" style="position:absolute;margin-left:30.55pt;margin-top:3.35pt;width:14.2pt;height:14.05pt;z-index:-16008704;mso-wrap-distance-left:0;mso-wrap-distance-right:0" coordsize="180340,178435" o:gfxdata="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">
                       <v:shape id="Graphic 11" o:spid="_x0000_s1027" style="position:absolute;left:7620;top:9144;width:163195;height:160020;visibility:visible;mso-wrap-style:square;v-text-anchor:top" coordsize="163195,160020" o:gfxdata="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" path="m163068,l,,,160020r163068,l163068,xe" fillcolor="#edebe0" stroked="f">
                         <v:path arrowok="t"/>
                       </v:shape>
@@ -2628,7 +2622,7 @@
                 </mc:Choice>
                 <mc:Fallback>
                   <w:pict>
-                    <v:group w14:anchorId="2B1BB088" id="Group 13" o:spid="_x0000_s1026" style="width:13.95pt;height:13.95pt;mso-position-horizontal-relative:char;mso-position-vertical-relative:line" coordsize="177165,177165" o:gfxdata="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">
+                    <v:group w14:anchorId="3215D447" id="Group 13" o:spid="_x0000_s1026" style="width:13.95pt;height:13.95pt;mso-position-horizontal-relative:char;mso-position-vertical-relative:line" coordsize="177165,177165" o:gfxdata="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">
                       <v:shape id="Graphic 14" o:spid="_x0000_s1027" style="position:absolute;left:6095;top:9144;width:165100;height:161925;visibility:visible;mso-wrap-style:square;v-text-anchor:top" coordsize="165100,161925" o:gfxdata="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" path="m164896,l,,,161544r164896,l164896,xe" fillcolor="#edebe0" stroked="f">
                         <v:path arrowok="t"/>
                       </v:shape>
@@ -2867,7 +2861,7 @@
                 </mc:Choice>
                 <mc:Fallback>
                   <w:pict>
-                    <v:group w14:anchorId="6E5C55E7" id="Group 20" o:spid="_x0000_s1026" style="position:absolute;margin-left:32.4pt;margin-top:-.5pt;width:14.3pt;height:14.2pt;z-index:-16008192;mso-wrap-distance-left:0;mso-wrap-distance-right:0" coordsize="181610,180340" o:gfxdata="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">
+                    <v:group w14:anchorId="07D83CA0" id="Group 20" o:spid="_x0000_s1026" style="position:absolute;margin-left:32.4pt;margin-top:-.5pt;width:14.3pt;height:14.2pt;z-index:-16008192;mso-wrap-distance-left:0;mso-wrap-distance-right:0" coordsize="181610,180340" o:gfxdata="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">
                       <v:shape id="Graphic 21" o:spid="_x0000_s1027" style="position:absolute;left:9144;top:9144;width:163195;height:161925;visibility:visible;mso-wrap-style:square;v-text-anchor:top" coordsize="163195,161925" o:gfxdata="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" path="m163067,l,,,161544r163067,l163067,xe" fillcolor="#edebe0" stroked="f">
                         <v:path arrowok="t"/>
                       </v:shape>
@@ -3489,7 +3483,7 @@
                 </mc:Choice>
                 <mc:Fallback>
                   <w:pict>
-                    <v:group w14:anchorId="4C8664E1" id="Group 23" o:spid="_x0000_s1026" style="position:absolute;margin-left:.25pt;margin-top:-.5pt;width:13.95pt;height:13.95pt;z-index:-16007680;mso-wrap-distance-left:0;mso-wrap-distance-right:0" coordsize="177165,177165" o:gfxdata="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">
+                    <v:group w14:anchorId="55C493B2" id="Group 23" o:spid="_x0000_s1026" style="position:absolute;margin-left:.25pt;margin-top:-.5pt;width:13.95pt;height:13.95pt;z-index:-16007680;mso-wrap-distance-left:0;mso-wrap-distance-right:0" coordsize="177165,177165" o:gfxdata="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">
                       <v:shape id="Graphic 24" o:spid="_x0000_s1027" style="position:absolute;left:6095;top:9143;width:165100;height:161925;visibility:visible;mso-wrap-style:square;v-text-anchor:top" coordsize="165100,161925" o:gfxdata="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" path="m164896,l,,,161544r164896,l164896,xe" fillcolor="#edebe0" stroked="f">
                         <v:path arrowok="t"/>
                       </v:shape>
@@ -3735,7 +3729,7 @@
                 </mc:Choice>
                 <mc:Fallback>
                   <w:pict>
-                    <v:group w14:anchorId="0A9D2043" id="Group 30" o:spid="_x0000_s1026" style="position:absolute;margin-left:32.4pt;margin-top:-.5pt;width:14.3pt;height:14.2pt;z-index:-16007168;mso-wrap-distance-left:0;mso-wrap-distance-right:0" coordsize="181610,180340" o:gfxdata="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">
+                    <v:group w14:anchorId="7781F89A" id="Group 30" o:spid="_x0000_s1026" style="position:absolute;margin-left:32.4pt;margin-top:-.5pt;width:14.3pt;height:14.2pt;z-index:-16007168;mso-wrap-distance-left:0;mso-wrap-distance-right:0" coordsize="181610,180340" o:gfxdata="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">
                       <v:shape id="Graphic 31" o:spid="_x0000_s1027" style="position:absolute;left:9144;top:9143;width:163195;height:161925;visibility:visible;mso-wrap-style:square;v-text-anchor:top" coordsize="163195,161925" o:gfxdata="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" path="m163067,l,,,161544r163067,l163067,xe" fillcolor="#edebe0" stroked="f">
                         <v:path arrowok="t"/>
                       </v:shape>
@@ -9177,7 +9171,7 @@
                 </mc:Choice>
                 <mc:Fallback>
                   <w:pict>
-                    <v:group w14:anchorId="31BA3FF3" id="Group 34" o:spid="_x0000_s1026" style="position:absolute;margin-left:40.55pt;margin-top:-8.15pt;width:111.4pt;height:26.4pt;z-index:-16005632;mso-wrap-distance-left:0;mso-wrap-distance-right:0" coordsize="14147,3352" o:gfxdata="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">
+                    <v:group w14:anchorId="26C04444" id="Group 34" o:spid="_x0000_s1026" style="position:absolute;margin-left:40.55pt;margin-top:-8.15pt;width:111.4pt;height:26.4pt;z-index:-16005632;mso-wrap-distance-left:0;mso-wrap-distance-right:0" coordsize="14147,3352" o:gfxdata="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">
                       <v:shape id="Graphic 35" o:spid="_x0000_s1027" style="position:absolute;width:14147;height:3352;visibility:visible;mso-wrap-style:square;v-text-anchor:top" coordsize="1414780,335280" o:gfxdata="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" path="m1414513,l,,,6096,,335280r1414513,l1414513,6096r,-6096xe" fillcolor="#edebe0" stroked="f">
                         <v:path arrowok="t"/>
                       </v:shape>
@@ -9697,7 +9691,7 @@
                 </mc:Choice>
                 <mc:Fallback>
                   <w:pict>
-                    <v:group w14:anchorId="04AE9FED" id="Group 36" o:spid="_x0000_s1026" style="width:27.5pt;height:25.6pt;mso-position-horizontal-relative:char;mso-position-vertical-relative:line" coordsize="349250,325120" o:gfxdata="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">
+                    <v:group w14:anchorId="68DEFFAC" id="Group 36" o:spid="_x0000_s1026" style="width:27.5pt;height:25.6pt;mso-position-horizontal-relative:char;mso-position-vertical-relative:line" coordsize="349250,325120" o:gfxdata="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">
                       <v:shape id="Graphic 37" o:spid="_x0000_s1027" style="position:absolute;left:6095;top:6095;width:337185;height:312420;visibility:visible;mso-wrap-style:square;v-text-anchor:top" coordsize="337185,312420" o:gfxdata="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" path="m336803,l,,,312420r336803,l336803,xe" fillcolor="#edebe0" stroked="f">
                         <v:path arrowok="t"/>
                       </v:shape>
@@ -10050,7 +10044,7 @@
                 </mc:Choice>
                 <mc:Fallback>
                   <w:pict>
-                    <v:group w14:anchorId="69567D00" id="Group 39" o:spid="_x0000_s1026" style="width:27.5pt;height:26.55pt;mso-position-horizontal-relative:char;mso-position-vertical-relative:line" coordsize="349250,337185" o:gfxdata="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">
+                    <v:group w14:anchorId="01B79B4F" id="Group 39" o:spid="_x0000_s1026" style="width:27.5pt;height:26.55pt;mso-position-horizontal-relative:char;mso-position-vertical-relative:line" coordsize="349250,337185" o:gfxdata="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">
                       <v:shape id="Graphic 40" o:spid="_x0000_s1027" style="position:absolute;left:6095;top:6172;width:337185;height:325120;visibility:visible;mso-wrap-style:square;v-text-anchor:top" coordsize="337185,325120" o:gfxdata="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" path="m336803,l,,,324916r336803,l336803,xe" fillcolor="#edebe0" stroked="f">
                         <v:path arrowok="t"/>
                       </v:shape>
@@ -10421,7 +10415,7 @@
                 </mc:Choice>
                 <mc:Fallback>
                   <w:pict>
-                    <v:group w14:anchorId="67D3B2E9" id="Group 42" o:spid="_x0000_s1026" style="position:absolute;margin-left:32.05pt;margin-top:60.9pt;width:432.1pt;height:.5pt;z-index:-16005120;mso-wrap-distance-left:0;mso-wrap-distance-right:0" coordsize="54876,63" o:gfxdata="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">
+                    <v:group w14:anchorId="4C9ED909" id="Group 42" o:spid="_x0000_s1026" style="position:absolute;margin-left:32.05pt;margin-top:60.9pt;width:432.1pt;height:.5pt;z-index:-16005120;mso-wrap-distance-left:0;mso-wrap-distance-right:0" coordsize="54876,63" o:gfxdata="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">
                       <v:shape id="Graphic 43" o:spid="_x0000_s1027" style="position:absolute;top:30;width:54876;height:13;visibility:visible;mso-wrap-style:square;v-text-anchor:top" coordsize="5487670,1270" o:gfxdata="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" path="m,l5487416,e" filled="f" strokeweight=".48pt">
                         <v:stroke dashstyle="3 1"/>
                         <v:path arrowok="t"/>
@@ -10620,7 +10614,7 @@
                 </mc:Choice>
                 <mc:Fallback>
                   <w:pict>
-                    <v:group w14:anchorId="6B9EB0F4" id="Group 44" o:spid="_x0000_s1026" style="position:absolute;margin-left:49.55pt;margin-top:-6.45pt;width:427.55pt;height:25.2pt;z-index:-16004608;mso-wrap-distance-left:0;mso-wrap-distance-right:0" coordsize="54298,3200" o:gfxdata="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">
+                    <v:group w14:anchorId="2DC1E089" id="Group 44" o:spid="_x0000_s1026" style="position:absolute;margin-left:49.55pt;margin-top:-6.45pt;width:427.55pt;height:25.2pt;z-index:-16004608;mso-wrap-distance-left:0;mso-wrap-distance-right:0" coordsize="54298,3200" o:gfxdata="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">
                       <v:shape id="Graphic 45" o:spid="_x0000_s1027" style="position:absolute;width:54298;height:3200;visibility:visible;mso-wrap-style:square;v-text-anchor:top" coordsize="5429885,320040" o:gfxdata="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" path="m5429377,l,,,6083,,320027r5429377,l5429377,6083r,-6083xe" fillcolor="#edebe0" stroked="f">
                         <v:path arrowok="t"/>
                       </v:shape>
@@ -12208,6 +12202,7 @@
   <w:style w:type="character" w:default="1" w:styleId="DefaultParagraphFont">
     <w:name w:val="Default Paragraph Font"/>
     <w:uiPriority w:val="1"/>
+    <w:semiHidden/>
     <w:unhideWhenUsed/>
   </w:style>
   <w:style w:type="table" w:default="1" w:styleId="TableNormal">

</xml_diff>